<commit_message>
Help button with built-in user guide (opens in a new tab); guide source, build script and Word copy; IT summary updated for version stamping and the guide tab
Co-Authored-By: Claude Sonnet 5.5 <noreply@anthropic.com>
</commit_message>
<xml_diff>
--- a/Watts Up - IT Summary and Security Assessment.docx
+++ b/Watts Up - IT Summary and Security Assessment.docx
@@ -40,7 +40,7 @@
           <w:b w:val="0"/>
           <w:i/>
         </w:rPr>
-        <w:t xml:space="preserve"> as of the release whose SHA-256 is given in §9; recompute the hash for any later copy before relying on this document.</w:t>
+        <w:t xml:space="preserve"> as of the release whose SHA-256 is given in §9; recompute the hash for any later copy before relying on this document. Current program version: 0.9.0 (testing build).</w:t>
       </w:r>
     </w:p>
     <w:p>
@@ -520,6 +520,14 @@
               </w:rPr>
               <w:t>no macros, no embedded or ActiveX objects, no external links</w:t>
             </w:r>
+            <w:r>
+              <w:rPr>
+                <w:b w:val="0"/>
+                <w:i w:val="0"/>
+                <w:sz w:val="19"/>
+              </w:rPr>
+              <w:t>. The user guide is also stored inside the file, as inert text (see §3.4)</w:t>
+            </w:r>
           </w:p>
         </w:tc>
       </w:tr>
@@ -600,7 +608,43 @@
                 <w:i w:val="0"/>
                 <w:sz w:val="19"/>
               </w:rPr>
-              <w:t>Manual: replace the file. There is no self-update mechanism</w:t>
+              <w:t>Manual: replace the file. There is no self-update mechanism and no update check. The program carries a version number (</w:t>
+            </w:r>
+            <w:r>
+              <w:rPr>
+                <w:rFonts w:ascii="Consolas" w:hAnsi="Consolas" w:eastAsia="Consolas"/>
+                <w:b w:val="0"/>
+                <w:i w:val="0"/>
+                <w:sz w:val="17"/>
+                <w:shd w:val="clear" w:color="auto" w:fill="EEF1F6"/>
+              </w:rPr>
+              <w:t>MAJOR.MINOR.PATCH</w:t>
+            </w:r>
+            <w:r>
+              <w:rPr>
+                <w:b w:val="0"/>
+                <w:i w:val="0"/>
+                <w:sz w:val="19"/>
+              </w:rPr>
+              <w:t xml:space="preserve">, shown in its header); each release is archived and published with a release note giving the version and SHA-256 (see </w:t>
+            </w:r>
+            <w:r>
+              <w:rPr>
+                <w:rFonts w:ascii="Consolas" w:hAnsi="Consolas" w:eastAsia="Consolas"/>
+                <w:b w:val="0"/>
+                <w:i w:val="0"/>
+                <w:sz w:val="17"/>
+                <w:shd w:val="clear" w:color="auto" w:fill="EEF1F6"/>
+              </w:rPr>
+              <w:t>RELEASING.md</w:t>
+            </w:r>
+            <w:r>
+              <w:rPr>
+                <w:b w:val="0"/>
+                <w:i w:val="0"/>
+                <w:sz w:val="19"/>
+              </w:rPr>
+              <w:t>)</w:t>
             </w:r>
           </w:p>
         </w:tc>
@@ -1009,7 +1053,7 @@
         </w:trPr>
         <w:tc>
           <w:tcPr>
-            <w:tcW w:type="dxa" w:w="2951"/>
+            <w:tcW w:type="dxa" w:w="2824"/>
             <w:shd w:val="clear" w:color="auto" w:fill="D9E2F3"/>
           </w:tcPr>
           <w:p>
@@ -1028,7 +1072,7 @@
         </w:tc>
         <w:tc>
           <w:tcPr>
-            <w:tcW w:type="dxa" w:w="3092"/>
+            <w:tcW w:type="dxa" w:w="3527"/>
             <w:shd w:val="clear" w:color="auto" w:fill="D9E2F3"/>
           </w:tcPr>
           <w:p>
@@ -1047,7 +1091,7 @@
         </w:tc>
         <w:tc>
           <w:tcPr>
-            <w:tcW w:type="dxa" w:w="3605"/>
+            <w:tcW w:type="dxa" w:w="3297"/>
             <w:shd w:val="clear" w:color="auto" w:fill="D9E2F3"/>
           </w:tcPr>
           <w:p>
@@ -1071,7 +1115,7 @@
         </w:trPr>
         <w:tc>
           <w:tcPr>
-            <w:tcW w:type="dxa" w:w="2951"/>
+            <w:tcW w:type="dxa" w:w="2824"/>
           </w:tcPr>
           <w:p>
             <w:pPr>
@@ -1117,7 +1161,7 @@
         </w:tc>
         <w:tc>
           <w:tcPr>
-            <w:tcW w:type="dxa" w:w="3092"/>
+            <w:tcW w:type="dxa" w:w="3527"/>
           </w:tcPr>
           <w:p>
             <w:pPr>
@@ -1135,7 +1179,7 @@
         </w:tc>
         <w:tc>
           <w:tcPr>
-            <w:tcW w:type="dxa" w:w="3605"/>
+            <w:tcW w:type="dxa" w:w="3297"/>
           </w:tcPr>
           <w:p>
             <w:pPr>
@@ -1158,7 +1202,7 @@
         </w:trPr>
         <w:tc>
           <w:tcPr>
-            <w:tcW w:type="dxa" w:w="2951"/>
+            <w:tcW w:type="dxa" w:w="2824"/>
           </w:tcPr>
           <w:p>
             <w:pPr>
@@ -1212,7 +1256,7 @@
         </w:tc>
         <w:tc>
           <w:tcPr>
-            <w:tcW w:type="dxa" w:w="3092"/>
+            <w:tcW w:type="dxa" w:w="3527"/>
           </w:tcPr>
           <w:p>
             <w:pPr>
@@ -1230,7 +1274,7 @@
         </w:tc>
         <w:tc>
           <w:tcPr>
-            <w:tcW w:type="dxa" w:w="3605"/>
+            <w:tcW w:type="dxa" w:w="3297"/>
           </w:tcPr>
           <w:p>
             <w:pPr>
@@ -1253,7 +1297,7 @@
         </w:trPr>
         <w:tc>
           <w:tcPr>
-            <w:tcW w:type="dxa" w:w="2951"/>
+            <w:tcW w:type="dxa" w:w="2824"/>
           </w:tcPr>
           <w:p>
             <w:pPr>
@@ -1265,7 +1309,25 @@
                 <w:i w:val="0"/>
                 <w:sz w:val="19"/>
               </w:rPr>
-              <w:t xml:space="preserve">Blob downloads / </w:t>
+              <w:t xml:space="preserve">Blob downloads, </w:t>
+            </w:r>
+            <w:r>
+              <w:rPr>
+                <w:rFonts w:ascii="Consolas" w:hAnsi="Consolas" w:eastAsia="Consolas"/>
+                <w:b w:val="0"/>
+                <w:i w:val="0"/>
+                <w:sz w:val="17"/>
+                <w:shd w:val="clear" w:color="auto" w:fill="EEF1F6"/>
+              </w:rPr>
+              <w:t>blob:</w:t>
+            </w:r>
+            <w:r>
+              <w:rPr>
+                <w:b w:val="0"/>
+                <w:i w:val="0"/>
+                <w:sz w:val="19"/>
+              </w:rPr>
+              <w:t xml:space="preserve"> page for the user guide, </w:t>
             </w:r>
             <w:r>
               <w:rPr>
@@ -1281,7 +1343,7 @@
         </w:tc>
         <w:tc>
           <w:tcPr>
-            <w:tcW w:type="dxa" w:w="3092"/>
+            <w:tcW w:type="dxa" w:w="3527"/>
           </w:tcPr>
           <w:p>
             <w:pPr>
@@ -1293,13 +1355,13 @@
                 <w:i w:val="0"/>
                 <w:sz w:val="19"/>
               </w:rPr>
-              <w:t>Fallback downloads, printing</w:t>
+              <w:t>Fallback downloads, the Help guide tab (built from text inside the file; no script in it), printing</w:t>
             </w:r>
           </w:p>
         </w:tc>
         <w:tc>
           <w:tcPr>
-            <w:tcW w:type="dxa" w:w="3605"/>
+            <w:tcW w:type="dxa" w:w="3297"/>
           </w:tcPr>
           <w:p>
             <w:pPr>
@@ -1311,7 +1373,7 @@
                 <w:i w:val="0"/>
                 <w:sz w:val="19"/>
               </w:rPr>
-              <w:t>Standard browser behaviour</w:t>
+              <w:t>In-memory addresses only; standard browser behaviour</w:t>
             </w:r>
           </w:p>
         </w:tc>
@@ -1322,7 +1384,7 @@
         </w:trPr>
         <w:tc>
           <w:tcPr>
-            <w:tcW w:type="dxa" w:w="2951"/>
+            <w:tcW w:type="dxa" w:w="2824"/>
           </w:tcPr>
           <w:p>
             <w:pPr>
@@ -1340,7 +1402,7 @@
         </w:tc>
         <w:tc>
           <w:tcPr>
-            <w:tcW w:type="dxa" w:w="3092"/>
+            <w:tcW w:type="dxa" w:w="3527"/>
           </w:tcPr>
           <w:p>
             <w:pPr>
@@ -1368,7 +1430,7 @@
         </w:tc>
         <w:tc>
           <w:tcPr>
-            <w:tcW w:type="dxa" w:w="3605"/>
+            <w:tcW w:type="dxa" w:w="3297"/>
           </w:tcPr>
           <w:p>
             <w:pPr>
@@ -1457,7 +1519,7 @@
           <w:b w:val="0"/>
           <w:i w:val="0"/>
         </w:rPr>
-        <w:t xml:space="preserve">, no web workers or service workers, no pop-up windows, no geolocation/camera/microphone/clipboard access, no IndexedDB, no </w:t>
+        <w:t xml:space="preserve">, no web workers or service workers, no geolocation/camera/microphone/clipboard access, no IndexedDB, no </w:t>
       </w:r>
       <w:r>
         <w:rPr>
@@ -1475,6 +1537,182 @@
           <w:i w:val="0"/>
         </w:rPr>
         <w:t>, no remote code loading other than JSZip, no execution of anything found in a project or Word file, no access to the network file system other than through a file the user chooses.</w:t>
+      </w:r>
+    </w:p>
+    <w:p>
+      <w:r>
+        <w:rPr>
+          <w:b/>
+          <w:i w:val="0"/>
+        </w:rPr>
+        <w:t>One new window, only when the user asks for it.</w:t>
+      </w:r>
+      <w:r>
+        <w:rPr>
+          <w:b w:val="0"/>
+          <w:i w:val="0"/>
+        </w:rPr>
+        <w:t xml:space="preserve"> The </w:t>
+      </w:r>
+      <w:r>
+        <w:rPr>
+          <w:b/>
+          <w:i w:val="0"/>
+        </w:rPr>
+        <w:t>Help</w:t>
+      </w:r>
+      <w:r>
+        <w:rPr>
+          <w:b w:val="0"/>
+          <w:i w:val="0"/>
+        </w:rPr>
+        <w:t xml:space="preserve"> button opens the user guide in a new browser tab. The guide is text stored inside </w:t>
+      </w:r>
+      <w:r>
+        <w:rPr>
+          <w:rFonts w:ascii="Consolas" w:hAnsi="Consolas" w:eastAsia="Consolas"/>
+          <w:b w:val="0"/>
+          <w:i w:val="0"/>
+          <w:sz w:val="19"/>
+          <w:shd w:val="clear" w:color="auto" w:fill="EEF1F6"/>
+        </w:rPr>
+        <w:t>watts-up.html</w:t>
+      </w:r>
+      <w:r>
+        <w:rPr>
+          <w:b w:val="0"/>
+          <w:i w:val="0"/>
+        </w:rPr>
+        <w:t xml:space="preserve"> (an inert </w:t>
+      </w:r>
+      <w:r>
+        <w:rPr>
+          <w:rFonts w:ascii="Consolas" w:hAnsi="Consolas" w:eastAsia="Consolas"/>
+          <w:b w:val="0"/>
+          <w:i w:val="0"/>
+          <w:sz w:val="19"/>
+          <w:shd w:val="clear" w:color="auto" w:fill="EEF1F6"/>
+        </w:rPr>
+        <w:t>&lt;script type="text/html"&gt;</w:t>
+      </w:r>
+      <w:r>
+        <w:rPr>
+          <w:b w:val="0"/>
+          <w:i w:val="0"/>
+        </w:rPr>
+        <w:t xml:space="preserve"> block that the browser never runs). On a click, the program fills in its version and date and opens the page from a </w:t>
+      </w:r>
+      <w:r>
+        <w:rPr>
+          <w:rFonts w:ascii="Consolas" w:hAnsi="Consolas" w:eastAsia="Consolas"/>
+          <w:b w:val="0"/>
+          <w:i w:val="0"/>
+          <w:sz w:val="19"/>
+          <w:shd w:val="clear" w:color="auto" w:fill="EEF1F6"/>
+        </w:rPr>
+        <w:t>blob:</w:t>
+      </w:r>
+      <w:r>
+        <w:rPr>
+          <w:b w:val="0"/>
+          <w:i w:val="0"/>
+        </w:rPr>
+        <w:t xml:space="preserve"> address created in the browser's memory — nothing is downloaded or fetched, the page contains </w:t>
+      </w:r>
+      <w:r>
+        <w:rPr>
+          <w:b/>
+          <w:i w:val="0"/>
+        </w:rPr>
+        <w:t>no script</w:t>
+      </w:r>
+      <w:r>
+        <w:rPr>
+          <w:b w:val="0"/>
+          <w:i w:val="0"/>
+        </w:rPr>
+        <w:t xml:space="preserve">, and it is opened with </w:t>
+      </w:r>
+      <w:r>
+        <w:rPr>
+          <w:rFonts w:ascii="Consolas" w:hAnsi="Consolas" w:eastAsia="Consolas"/>
+          <w:b w:val="0"/>
+          <w:i w:val="0"/>
+          <w:sz w:val="19"/>
+          <w:shd w:val="clear" w:color="auto" w:fill="EEF1F6"/>
+        </w:rPr>
+        <w:t>noopener</w:t>
+      </w:r>
+      <w:r>
+        <w:rPr>
+          <w:b w:val="0"/>
+          <w:i w:val="0"/>
+        </w:rPr>
+        <w:t xml:space="preserve"> so it has no link back to the program's window. No other window, pop-up or redirect is ever opened.</w:t>
+      </w:r>
+    </w:p>
+    <w:p>
+      <w:r>
+        <w:rPr>
+          <w:b/>
+          <w:i w:val="0"/>
+        </w:rPr>
+        <w:t>Version stamping.</w:t>
+      </w:r>
+      <w:r>
+        <w:rPr>
+          <w:b w:val="0"/>
+          <w:i w:val="0"/>
+        </w:rPr>
+        <w:t xml:space="preserve"> Project files and Word reports record the version of the program that made them (</w:t>
+      </w:r>
+      <w:r>
+        <w:rPr>
+          <w:rFonts w:ascii="Consolas" w:hAnsi="Consolas" w:eastAsia="Consolas"/>
+          <w:b w:val="0"/>
+          <w:i w:val="0"/>
+          <w:sz w:val="19"/>
+          <w:shd w:val="clear" w:color="auto" w:fill="EEF1F6"/>
+        </w:rPr>
+        <w:t>appVersion</w:t>
+      </w:r>
+      <w:r>
+        <w:rPr>
+          <w:b w:val="0"/>
+          <w:i w:val="0"/>
+        </w:rPr>
+        <w:t xml:space="preserve"> in the project data; a </w:t>
+      </w:r>
+      <w:r>
+        <w:rPr>
+          <w:rFonts w:ascii="Consolas" w:hAnsi="Consolas" w:eastAsia="Consolas"/>
+          <w:b w:val="0"/>
+          <w:i w:val="0"/>
+          <w:sz w:val="19"/>
+          <w:shd w:val="clear" w:color="auto" w:fill="EEF1F6"/>
+        </w:rPr>
+        <w:t>WattsUpVersion</w:t>
+      </w:r>
+      <w:r>
+        <w:rPr>
+          <w:b w:val="0"/>
+          <w:i w:val="0"/>
+        </w:rPr>
+        <w:t xml:space="preserve"> Word document property). This is a local text value; it is not sent anywhere. When a file made by a </w:t>
+      </w:r>
+      <w:r>
+        <w:rPr>
+          <w:b w:val="0"/>
+          <w:i/>
+        </w:rPr>
+        <w:t>newer</w:t>
+      </w:r>
+      <w:r>
+        <w:rPr>
+          <w:b w:val="0"/>
+          <w:i w:val="0"/>
+        </w:rPr>
+        <w:t xml:space="preserve"> version is opened, the program shows a confirmation prompt.</w:t>
       </w:r>
     </w:p>
     <w:p>
@@ -3162,7 +3400,24 @@
           <w:b w:val="0"/>
           <w:i w:val="0"/>
         </w:rPr>
-        <w:t>8.  Keep a copy of previous versions so a change can be rolled back.</w:t>
+        <w:t>8.  Keep a copy of every released version (</w:t>
+      </w:r>
+      <w:r>
+        <w:rPr>
+          <w:rFonts w:ascii="Consolas" w:hAnsi="Consolas" w:eastAsia="Consolas"/>
+          <w:b w:val="0"/>
+          <w:i w:val="0"/>
+          <w:sz w:val="19"/>
+          <w:shd w:val="clear" w:color="auto" w:fill="EEF1F6"/>
+        </w:rPr>
+        <w:t>releases\watts-up-X.Y.Z.html</w:t>
+      </w:r>
+      <w:r>
+        <w:rPr>
+          <w:b w:val="0"/>
+          <w:i w:val="0"/>
+        </w:rPr>
+        <w:t>) so a change can be rolled back, and publish a release note with each version's SHA-256. Users can see which version they are running in the program header.</w:t>
       </w:r>
     </w:p>
     <w:p>
@@ -3531,6 +3786,56 @@
       </w:r>
     </w:p>
     <w:p>
+      <w:r>
+        <w:rPr>
+          <w:b/>
+          <w:i w:val="0"/>
+        </w:rPr>
+        <w:t>Addendum, 2026-10-18 (version 0.9.0 — versioning and the Help guide).</w:t>
+      </w:r>
+      <w:r>
+        <w:rPr>
+          <w:b w:val="0"/>
+          <w:i w:val="0"/>
+        </w:rPr>
+        <w:t xml:space="preserve"> Reviewed the two additions. (1) The version a file claims is used only after it matches a strict </w:t>
+      </w:r>
+      <w:r>
+        <w:rPr>
+          <w:rFonts w:ascii="Consolas" w:hAnsi="Consolas" w:eastAsia="Consolas"/>
+          <w:b w:val="0"/>
+          <w:i w:val="0"/>
+          <w:sz w:val="19"/>
+          <w:shd w:val="clear" w:color="auto" w:fill="EEF1F6"/>
+        </w:rPr>
+        <w:t>number.number.number</w:t>
+      </w:r>
+      <w:r>
+        <w:rPr>
+          <w:b w:val="0"/>
+          <w:i w:val="0"/>
+        </w:rPr>
+        <w:t xml:space="preserve"> pattern, and is shown in a plain-text confirmation, never inserted into a page. (2) The Help page is built only from text constants inside the program (no project data, nothing from a file), contains no script, and is opened with </w:t>
+      </w:r>
+      <w:r>
+        <w:rPr>
+          <w:rFonts w:ascii="Consolas" w:hAnsi="Consolas" w:eastAsia="Consolas"/>
+          <w:b w:val="0"/>
+          <w:i w:val="0"/>
+          <w:sz w:val="19"/>
+          <w:shd w:val="clear" w:color="auto" w:fill="EEF1F6"/>
+        </w:rPr>
+        <w:t>noopener</w:t>
+      </w:r>
+      <w:r>
+        <w:rPr>
+          <w:b w:val="0"/>
+          <w:i w:val="0"/>
+        </w:rPr>
+        <w:t>. Tested: a project file with a malformed or markup-bearing version is treated as unstamped; the guide page contains no script element and no unreplaced placeholders.</w:t>
+      </w:r>
+    </w:p>
+    <w:p>
       <w:pPr>
         <w:pStyle w:val="Heading2"/>
       </w:pPr>
@@ -3746,7 +4051,7 @@
           <w:b/>
           <w:i w:val="0"/>
         </w:rPr>
-        <w:t>, 652,429 bytes):</w:t>
+        <w:t>, version 0.9.0, 688,517 bytes):</w:t>
       </w:r>
       <w:r>
         <w:rPr>
@@ -3763,7 +4068,7 @@
           <w:sz w:val="19"/>
           <w:shd w:val="clear" w:color="auto" w:fill="EEF1F6"/>
         </w:rPr>
-        <w:t>7e4af3ce7b38d47b4be0c07d27d99cec462355546fdd4fdae22cff97fce7ef44</w:t>
+        <w:t>d86c09341d39717a8b51aa89a0c35a477ddd90b2a686aa8cf4f3fe0ccd1047f3</w:t>
       </w:r>
       <w:r>
         <w:rPr>

</xml_diff>

<commit_message>
Revision 83 phase 2 (version 0.9.1): one Word Summary table per section with keep-with-next groups, single AC/DC paragraph, grid status-badge focus, Word Connect Different / Disconnect; guide, changelog and IT summary updated
Co-Authored-By: Claude Sonnet 5.5 <noreply@anthropic.com>
</commit_message>
<xml_diff>
--- a/Watts Up - IT Summary and Security Assessment.docx
+++ b/Watts Up - IT Summary and Security Assessment.docx
@@ -40,7 +40,7 @@
           <w:b w:val="0"/>
           <w:i/>
         </w:rPr>
-        <w:t xml:space="preserve"> as of the release whose SHA-256 is given in §9; recompute the hash for any later copy before relying on this document. Current program version: 0.9.0 (testing build).</w:t>
+        <w:t xml:space="preserve"> as of the release whose SHA-256 is given in §9; recompute the hash for any later copy before relying on this document. Current program version: 0.9.1 (testing build).</w:t>
       </w:r>
     </w:p>
     <w:p>
@@ -3791,7 +3791,7 @@
           <w:b/>
           <w:i w:val="0"/>
         </w:rPr>
-        <w:t>Addendum, 2026-10-18 (version 0.9.0 — versioning and the Help guide).</w:t>
+        <w:t>Addendum, 2026-10-18 (version 0.9.0 onward — versioning and the Help guide; 0.9.1 changed only report layout, the Word Report dialog and one grid focus handler, with no new network, storage or window behavior).</w:t>
       </w:r>
       <w:r>
         <w:rPr>
@@ -4051,7 +4051,7 @@
           <w:b/>
           <w:i w:val="0"/>
         </w:rPr>
-        <w:t>, version 0.9.0, 688,517 bytes):</w:t>
+        <w:t>, version 0.9.1, 692,238 bytes):</w:t>
       </w:r>
       <w:r>
         <w:rPr>
@@ -4068,7 +4068,7 @@
           <w:sz w:val="19"/>
           <w:shd w:val="clear" w:color="auto" w:fill="EEF1F6"/>
         </w:rPr>
-        <w:t>d86c09341d39717a8b51aa89a0c35a477ddd90b2a686aa8cf4f3fe0ccd1047f3</w:t>
+        <w:t>4e7761be96673e4427274eac43cf10c69035d725ac3c7393a4e6e70b29f8bea9</w:t>
       </w:r>
       <w:r>
         <w:rPr>

</xml_diff>

<commit_message>
Version 0.9.2: vertical Word report label column 20% (12% with more than 10 value columns), CB 6.5%, Notes 5% with 7 pt header
Co-Authored-By: Claude Sonnet 5.5 <noreply@anthropic.com>
</commit_message>
<xml_diff>
--- a/Watts Up - IT Summary and Security Assessment.docx
+++ b/Watts Up - IT Summary and Security Assessment.docx
@@ -40,7 +40,7 @@
           <w:b w:val="0"/>
           <w:i/>
         </w:rPr>
-        <w:t xml:space="preserve"> as of the release whose SHA-256 is given in §9; recompute the hash for any later copy before relying on this document. Current program version: 0.9.1 (testing build).</w:t>
+        <w:t xml:space="preserve"> as of the release whose SHA-256 is given in §9; recompute the hash for any later copy before relying on this document. Current program version: 0.9.2 (testing build).</w:t>
       </w:r>
     </w:p>
     <w:p>
@@ -3791,7 +3791,7 @@
           <w:b/>
           <w:i w:val="0"/>
         </w:rPr>
-        <w:t>Addendum, 2026-10-18 (version 0.9.0 onward — versioning and the Help guide; 0.9.1 changed only report layout, the Word Report dialog and one grid focus handler, with no new network, storage or window behavior).</w:t>
+        <w:t>Addendum, 2026-10-18 (version 0.9.0 onward — versioning and the Help guide; 0.9.1 and 0.9.2 changed only report layout, the Word Report dialog and one grid focus handler, with no new network, storage or window behavior).</w:t>
       </w:r>
       <w:r>
         <w:rPr>
@@ -4051,7 +4051,7 @@
           <w:b/>
           <w:i w:val="0"/>
         </w:rPr>
-        <w:t>, version 0.9.1, 692,238 bytes):</w:t>
+        <w:t>, version 0.9.2, 692,537 bytes):</w:t>
       </w:r>
       <w:r>
         <w:rPr>
@@ -4068,7 +4068,7 @@
           <w:sz w:val="19"/>
           <w:shd w:val="clear" w:color="auto" w:fill="EEF1F6"/>
         </w:rPr>
-        <w:t>4e7761be96673e4427274eac43cf10c69035d725ac3c7393a4e6e70b29f8bea9</w:t>
+        <w:t>81b2f69f703aeefb58cb7ff41bb842bcaf4e64beba4e94a6a010e978605c7084</w:t>
       </w:r>
       <w:r>
         <w:rPr>

</xml_diff>

<commit_message>
Version 0.9.3: vertical Word report label column 30% for 6 or fewer value columns; two-line sibling headers
Co-Authored-By: Claude Sonnet 5.5 <noreply@anthropic.com>
</commit_message>
<xml_diff>
--- a/Watts Up - IT Summary and Security Assessment.docx
+++ b/Watts Up - IT Summary and Security Assessment.docx
@@ -40,7 +40,7 @@
           <w:b w:val="0"/>
           <w:i/>
         </w:rPr>
-        <w:t xml:space="preserve"> as of the release whose SHA-256 is given in §9; recompute the hash for any later copy before relying on this document. Current program version: 0.9.2 (testing build).</w:t>
+        <w:t xml:space="preserve"> as of the release whose SHA-256 is given in §9; recompute the hash for any later copy before relying on this document. Current program version: 0.9.3 (testing build).</w:t>
       </w:r>
     </w:p>
     <w:p>
@@ -3791,7 +3791,7 @@
           <w:b/>
           <w:i w:val="0"/>
         </w:rPr>
-        <w:t>Addendum, 2026-10-18 (version 0.9.0 onward — versioning and the Help guide; 0.9.1 and 0.9.2 changed only report layout, the Word Report dialog and one grid focus handler, with no new network, storage or window behavior).</w:t>
+        <w:t>Addendum, 2026-10-18 (version 0.9.0 onward — versioning and the Help guide; 0.9.1 to 0.9.3 changed only report layout, the Word Report dialog and one grid focus handler, with no new network, storage or window behavior).</w:t>
       </w:r>
       <w:r>
         <w:rPr>
@@ -4051,7 +4051,7 @@
           <w:b/>
           <w:i w:val="0"/>
         </w:rPr>
-        <w:t>, version 0.9.2, 692,537 bytes):</w:t>
+        <w:t>, version 0.9.3, 693,033 bytes):</w:t>
       </w:r>
       <w:r>
         <w:rPr>
@@ -4068,7 +4068,7 @@
           <w:sz w:val="19"/>
           <w:shd w:val="clear" w:color="auto" w:fill="EEF1F6"/>
         </w:rPr>
-        <w:t>81b2f69f703aeefb58cb7ff41bb842bcaf4e64beba4e94a6a010e978605c7084</w:t>
+        <w:t>e0d73b3c6bfd42b55d9d4db3ceaca7913f7a0e734650c2498bc5f613a7b71c20</w:t>
       </w:r>
       <w:r>
         <w:rPr>

</xml_diff>

<commit_message>
Version 0.9.4: mirror TRU input phase add/remove on shared TRUs, repair partly shared phase groups when opening a file, keep phases apart in vertical detail tables
Co-Authored-By: Claude Sonnet 5.5 <noreply@anthropic.com>
</commit_message>
<xml_diff>
--- a/Watts Up - IT Summary and Security Assessment.docx
+++ b/Watts Up - IT Summary and Security Assessment.docx
@@ -40,7 +40,7 @@
           <w:b w:val="0"/>
           <w:i/>
         </w:rPr>
-        <w:t xml:space="preserve"> as of the release whose SHA-256 is given in §9; recompute the hash for any later copy before relying on this document. Current program version: 0.9.3 (testing build).</w:t>
+        <w:t xml:space="preserve"> as of the release whose SHA-256 is given in §9; recompute the hash for any later copy before relying on this document. Current program version: 0.9.4 (testing build).</w:t>
       </w:r>
     </w:p>
     <w:p>
@@ -3791,7 +3791,7 @@
           <w:b/>
           <w:i w:val="0"/>
         </w:rPr>
-        <w:t>Addendum, 2026-10-18 (version 0.9.0 onward — versioning and the Help guide; 0.9.1 to 0.9.3 changed only report layout, the Word Report dialog and one grid focus handler, with no new network, storage or window behavior).</w:t>
+        <w:t>Addendum, 2026-10-18 (version 0.9.0 onward — versioning and the Help guide; 0.9.1 to 0.9.4 changed only report layout, the Word Report dialog, one grid focus handler, shared-TRU editing and a load-time data repair, with no new network, storage or window behavior).</w:t>
       </w:r>
       <w:r>
         <w:rPr>
@@ -4051,7 +4051,7 @@
           <w:b/>
           <w:i w:val="0"/>
         </w:rPr>
-        <w:t>, version 0.9.3, 693,033 bytes):</w:t>
+        <w:t>, version 0.9.4, 702,106 bytes):</w:t>
       </w:r>
       <w:r>
         <w:rPr>
@@ -4068,7 +4068,7 @@
           <w:sz w:val="19"/>
           <w:shd w:val="clear" w:color="auto" w:fill="EEF1F6"/>
         </w:rPr>
-        <w:t>e0d73b3c6bfd42b55d9d4db3ceaca7913f7a0e734650c2498bc5f613a7b71c20</w:t>
+        <w:t>3cf237084a693792f5a586f8805134cffc984ef62b1c7b4b818833720c5a4839</w:t>
       </w:r>
       <w:r>
         <w:rPr>

</xml_diff>

<commit_message>
Version 0.9.5: Word note hanging indent, horizontal detail loads under Net Change, DC grid accent, VA/Vector report presets, Dynamic rounding limits, TRU transfer note
Co-Authored-By: Claude Sonnet 5.5 <noreply@anthropic.com>
</commit_message>
<xml_diff>
--- a/Watts Up - IT Summary and Security Assessment.docx
+++ b/Watts Up - IT Summary and Security Assessment.docx
@@ -40,7 +40,7 @@
           <w:b w:val="0"/>
           <w:i/>
         </w:rPr>
-        <w:t xml:space="preserve"> as of the release whose SHA-256 is given in §9; recompute the hash for any later copy before relying on this document. Current program version: 0.9.4 (testing build).</w:t>
+        <w:t xml:space="preserve"> as of the release whose SHA-256 is given in §9; recompute the hash for any later copy before relying on this document. Current program version: 0.9.5 (testing build).</w:t>
       </w:r>
     </w:p>
     <w:p>
@@ -3791,7 +3791,7 @@
           <w:b/>
           <w:i w:val="0"/>
         </w:rPr>
-        <w:t>Addendum, 2026-10-18 (version 0.9.0 onward — versioning and the Help guide; 0.9.1 to 0.9.4 changed only report layout, the Word Report dialog, one grid focus handler, shared-TRU editing and a load-time data repair, with no new network, storage or window behavior).</w:t>
+        <w:t>Addendum, 2026-10-18 (version 0.9.0 onward — versioning and the Help guide; 0.9.1 to 0.9.5 changed only report layout and formatting, the Word Report dialog, one grid focus handler, shared-TRU editing, a load-time data repair and a generated row note, with no new network, storage or window behavior).</w:t>
       </w:r>
       <w:r>
         <w:rPr>
@@ -4051,7 +4051,7 @@
           <w:b/>
           <w:i w:val="0"/>
         </w:rPr>
-        <w:t>, version 0.9.4, 702,106 bytes):</w:t>
+        <w:t>, version 0.9.5, 712,503 bytes):</w:t>
       </w:r>
       <w:r>
         <w:rPr>
@@ -4068,7 +4068,7 @@
           <w:sz w:val="19"/>
           <w:shd w:val="clear" w:color="auto" w:fill="EEF1F6"/>
         </w:rPr>
-        <w:t>3cf237084a693792f5a586f8805134cffc984ef62b1c7b4b818833720c5a4839</w:t>
+        <w:t>348dbd318d6e8819f813a79ca8badbea85bfe0b1ad49bea9afc4e761e438bc04</w:t>
       </w:r>
       <w:r>
         <w:rPr>

</xml_diff>

<commit_message>
Version 0.9.6: change tracking, stage 1 - Changes dialog (Tracking On/Off, Accept All), baseline saved with the project, underlines for changed numbers and items in the Summary tab, horizontal detail, Print and Word
Co-Authored-By: Claude Sonnet 5.5 <noreply@anthropic.com>
</commit_message>
<xml_diff>
--- a/Watts Up - IT Summary and Security Assessment.docx
+++ b/Watts Up - IT Summary and Security Assessment.docx
@@ -40,7 +40,7 @@
           <w:b w:val="0"/>
           <w:i/>
         </w:rPr>
-        <w:t xml:space="preserve"> as of the release whose SHA-256 is given in §9; recompute the hash for any later copy before relying on this document. Current program version: 0.9.5 (testing build).</w:t>
+        <w:t xml:space="preserve"> as of the release whose SHA-256 is given in §9; recompute the hash for any later copy before relying on this document. Current program version: 0.9.6 (testing build).</w:t>
       </w:r>
     </w:p>
     <w:p>
@@ -3791,7 +3791,7 @@
           <w:b/>
           <w:i w:val="0"/>
         </w:rPr>
-        <w:t>Addendum, 2026-10-18 (version 0.9.0 onward — versioning and the Help guide; 0.9.1 to 0.9.5 changed only report layout and formatting, the Word Report dialog, one grid focus handler, shared-TRU editing, a load-time data repair and a generated row note, with no new network, storage or window behavior).</w:t>
+        <w:t>Addendum, 2026-10-18 (version 0.9.0 onward — versioning and the Help guide; 0.9.1 to 0.9.6 changed only report layout and formatting, change-tracking marks (a second copy of the project's items stored in the project file), the Word Report dialog, one grid focus handler, shared-TRU editing, a load-time data repair and a generated row note, with no new network, storage or window behavior).</w:t>
       </w:r>
       <w:r>
         <w:rPr>
@@ -4051,7 +4051,7 @@
           <w:b/>
           <w:i w:val="0"/>
         </w:rPr>
-        <w:t>, version 0.9.5, 712,503 bytes):</w:t>
+        <w:t>, version 0.9.6, 729,704 bytes):</w:t>
       </w:r>
       <w:r>
         <w:rPr>
@@ -4068,7 +4068,7 @@
           <w:sz w:val="19"/>
           <w:shd w:val="clear" w:color="auto" w:fill="EEF1F6"/>
         </w:rPr>
-        <w:t>348dbd318d6e8819f813a79ca8badbea85bfe0b1ad49bea9afc4e761e438bc04</w:t>
+        <w:t>ef99f940fc85a3520fe60bd0d9a9adc7cbec6100d37ff1f13fab01c0ae7cd886</w:t>
       </w:r>
       <w:r>
         <w:rPr>

</xml_diff>

<commit_message>
Version 0.9.7: change tracking stage 2 - marks in the vertical detail and Power Distribution Summary, row notes and references tracked, baseline-value tooltips
Co-Authored-By: Claude Sonnet 5.5 <noreply@anthropic.com>
</commit_message>
<xml_diff>
--- a/Watts Up - IT Summary and Security Assessment.docx
+++ b/Watts Up - IT Summary and Security Assessment.docx
@@ -40,7 +40,7 @@
           <w:b w:val="0"/>
           <w:i/>
         </w:rPr>
-        <w:t xml:space="preserve"> as of the release whose SHA-256 is given in §9; recompute the hash for any later copy before relying on this document. Current program version: 0.9.6 (testing build).</w:t>
+        <w:t xml:space="preserve"> as of the release whose SHA-256 is given in §9; recompute the hash for any later copy before relying on this document. Current program version: 0.9.7 (testing build).</w:t>
       </w:r>
     </w:p>
     <w:p>
@@ -3791,7 +3791,7 @@
           <w:b/>
           <w:i w:val="0"/>
         </w:rPr>
-        <w:t>Addendum, 2026-10-18 (version 0.9.0 onward — versioning and the Help guide; 0.9.1 to 0.9.6 changed only report layout and formatting, change-tracking marks (a second copy of the project's items stored in the project file), the Word Report dialog, one grid focus handler, shared-TRU editing, a load-time data repair and a generated row note, with no new network, storage or window behavior).</w:t>
+        <w:t>Addendum, 2026-10-18 (version 0.9.0 onward — versioning and the Help guide; 0.9.1 to 0.9.7 changed only report layout and formatting, change-tracking marks (a second copy of the project's items stored in the project file), the Word Report dialog, one grid focus handler, shared-TRU editing, a load-time data repair and a generated row note, with no new network, storage or window behavior).</w:t>
       </w:r>
       <w:r>
         <w:rPr>
@@ -4051,7 +4051,7 @@
           <w:b/>
           <w:i w:val="0"/>
         </w:rPr>
-        <w:t>, version 0.9.6, 729,704 bytes):</w:t>
+        <w:t>, version 0.9.7, 735,438 bytes):</w:t>
       </w:r>
       <w:r>
         <w:rPr>
@@ -4068,7 +4068,7 @@
           <w:sz w:val="19"/>
           <w:shd w:val="clear" w:color="auto" w:fill="EEF1F6"/>
         </w:rPr>
-        <w:t>ef99f940fc85a3520fe60bd0d9a9adc7cbec6100d37ff1f13fab01c0ae7cd886</w:t>
+        <w:t>df2b1d4897e111b58a492d1849dc569b59a14d9c4de5a0ca04903609a16eefdc</w:t>
       </w:r>
       <w:r>
         <w:rPr>

</xml_diff>

<commit_message>
Version 0.9.8: change tracking, final stage - Reject All, per-item Accept/Reject Change, Tracked Changes panel with deleted items
Co-Authored-By: Claude Sonnet 5.5 <noreply@anthropic.com>
</commit_message>
<xml_diff>
--- a/Watts Up - IT Summary and Security Assessment.docx
+++ b/Watts Up - IT Summary and Security Assessment.docx
@@ -40,7 +40,7 @@
           <w:b w:val="0"/>
           <w:i/>
         </w:rPr>
-        <w:t xml:space="preserve"> as of the release whose SHA-256 is given in §9; recompute the hash for any later copy before relying on this document. Current program version: 0.9.7 (testing build).</w:t>
+        <w:t xml:space="preserve"> as of the release whose SHA-256 is given in §9; recompute the hash for any later copy before relying on this document. Current program version: 0.9.8 (testing build).</w:t>
       </w:r>
     </w:p>
     <w:p>
@@ -3791,7 +3791,7 @@
           <w:b/>
           <w:i w:val="0"/>
         </w:rPr>
-        <w:t>Addendum, 2026-10-18 (version 0.9.0 onward — versioning and the Help guide; 0.9.1 to 0.9.7 changed only report layout and formatting, change-tracking marks (a second copy of the project's items stored in the project file), the Word Report dialog, one grid focus handler, shared-TRU editing, a load-time data repair and a generated row note, with no new network, storage or window behavior).</w:t>
+        <w:t>Addendum, 2026-10-18 (version 0.9.0 onward — versioning and the Help guide; 0.9.1 to 0.9.8 changed only report layout and formatting, change-tracking marks (a second copy of the project's items stored in the project file), the Word Report dialog, one grid focus handler, shared-TRU editing, a load-time data repair and a generated row note, with no new network, storage or window behavior).</w:t>
       </w:r>
       <w:r>
         <w:rPr>
@@ -4051,7 +4051,7 @@
           <w:b/>
           <w:i w:val="0"/>
         </w:rPr>
-        <w:t>, version 0.9.7, 735,438 bytes):</w:t>
+        <w:t>, version 0.9.8, 751,203 bytes):</w:t>
       </w:r>
       <w:r>
         <w:rPr>
@@ -4068,7 +4068,7 @@
           <w:sz w:val="19"/>
           <w:shd w:val="clear" w:color="auto" w:fill="EEF1F6"/>
         </w:rPr>
-        <w:t>df2b1d4897e111b58a492d1849dc569b59a14d9c4de5a0ca04903609a16eefdc</w:t>
+        <w:t>ff56d6e4896017892d4cb1161b6cfc9082c706727865b4e7c21ff38a9a6f9544</w:t>
       </w:r>
       <w:r>
         <w:rPr>

</xml_diff>

<commit_message>
Version 0.9.9: no row notes in the Power Distribution Summary, TRU note wording (eff. / pf / Ø, single phase omitted), Notes [Ref.] heading, changed reference no longer underlines citing row notes
Co-Authored-By: Claude Sonnet 5.5 <noreply@anthropic.com>
</commit_message>
<xml_diff>
--- a/Watts Up - IT Summary and Security Assessment.docx
+++ b/Watts Up - IT Summary and Security Assessment.docx
@@ -40,7 +40,7 @@
           <w:b w:val="0"/>
           <w:i/>
         </w:rPr>
-        <w:t xml:space="preserve"> as of the release whose SHA-256 is given in §9; recompute the hash for any later copy before relying on this document. Current program version: 0.9.8 (testing build).</w:t>
+        <w:t xml:space="preserve"> as of the release whose SHA-256 is given in §9; recompute the hash for any later copy before relying on this document. Current program version: 0.9.9 (testing build).</w:t>
       </w:r>
     </w:p>
     <w:p>
@@ -3791,7 +3791,7 @@
           <w:b/>
           <w:i w:val="0"/>
         </w:rPr>
-        <w:t>Addendum, 2026-10-18 (version 0.9.0 onward — versioning and the Help guide; 0.9.1 to 0.9.8 changed only report layout and formatting, change-tracking marks (a second copy of the project's items stored in the project file), the Word Report dialog, one grid focus handler, shared-TRU editing, a load-time data repair and a generated row note, with no new network, storage or window behavior).</w:t>
+        <w:t>Addendum, 2026-10-18 (version 0.9.0 onward — versioning and the Help guide; 0.9.1 to 0.9.9 changed only report layout and formatting, change-tracking marks (a second copy of the project's items stored in the project file), the Word Report dialog, one grid focus handler, shared-TRU editing, a load-time data repair and a generated row note, with no new network, storage or window behavior).</w:t>
       </w:r>
       <w:r>
         <w:rPr>
@@ -4051,7 +4051,7 @@
           <w:b/>
           <w:i w:val="0"/>
         </w:rPr>
-        <w:t>, version 0.9.8, 751,203 bytes):</w:t>
+        <w:t>, version 0.9.9, 751,318 bytes):</w:t>
       </w:r>
       <w:r>
         <w:rPr>
@@ -4068,7 +4068,7 @@
           <w:sz w:val="19"/>
           <w:shd w:val="clear" w:color="auto" w:fill="EEF1F6"/>
         </w:rPr>
-        <w:t>ff56d6e4896017892d4cb1161b6cfc9082c706727865b4e7c21ff38a9a6f9544</w:t>
+        <w:t>9600c064680fb6e2a52dfde9642c261ee1c5fba8390c7238726ea6c99dee73f9</w:t>
       </w:r>
       <w:r>
         <w:rPr>

</xml_diff>

<commit_message>
Version 0.9.10: user guide edits - grid adding items and TRU drop-down, Add Item(s) dialog section, override note, reset note, removal of latent-functionality mentions
Co-Authored-By: Claude Sonnet 5.5 <noreply@anthropic.com>
</commit_message>
<xml_diff>
--- a/Watts Up - IT Summary and Security Assessment.docx
+++ b/Watts Up - IT Summary and Security Assessment.docx
@@ -40,7 +40,7 @@
           <w:b w:val="0"/>
           <w:i/>
         </w:rPr>
-        <w:t xml:space="preserve"> as of the release whose SHA-256 is given in §9; recompute the hash for any later copy before relying on this document. Current program version: 0.9.9 (testing build).</w:t>
+        <w:t xml:space="preserve"> as of the release whose SHA-256 is given in §9; recompute the hash for any later copy before relying on this document. Current program version: 0.9.10 (testing build).</w:t>
       </w:r>
     </w:p>
     <w:p>
@@ -3791,7 +3791,7 @@
           <w:b/>
           <w:i w:val="0"/>
         </w:rPr>
-        <w:t>Addendum, 2026-10-18 (version 0.9.0 onward — versioning and the Help guide; 0.9.1 to 0.9.9 changed only report layout and formatting, change-tracking marks (a second copy of the project's items stored in the project file), the Word Report dialog, one grid focus handler, shared-TRU editing, a load-time data repair and a generated row note, with no new network, storage or window behavior).</w:t>
+        <w:t>Addendum, 2026-10-18 (version 0.9.0 onward — versioning and the Help guide; 0.9.1 to 0.9.10 changed only report layout and formatting, change-tracking marks (a second copy of the project's items stored in the project file), the Word Report dialog, one grid focus handler, shared-TRU editing, a load-time data repair and a generated row note, with no new network, storage or window behavior).</w:t>
       </w:r>
       <w:r>
         <w:rPr>
@@ -4051,7 +4051,7 @@
           <w:b/>
           <w:i w:val="0"/>
         </w:rPr>
-        <w:t>, version 0.9.9, 751,318 bytes):</w:t>
+        <w:t>, version 0.9.10, 753,787 bytes):</w:t>
       </w:r>
       <w:r>
         <w:rPr>
@@ -4068,7 +4068,7 @@
           <w:sz w:val="19"/>
           <w:shd w:val="clear" w:color="auto" w:fill="EEF1F6"/>
         </w:rPr>
-        <w:t>9600c064680fb6e2a52dfde9642c261ee1c5fba8390c7238726ea6c99dee73f9</w:t>
+        <w:t>9014b7f48b87306d514cbb093787c28190125431f3ee8e720ef2202755fef682</w:t>
       </w:r>
       <w:r>
         <w:rPr>

</xml_diff>

<commit_message>
Version 0.9.11: moving an unlabeled item to the top level no longer erases the phase splits below it
Co-Authored-By: Claude Sonnet 5.5 <noreply@anthropic.com>
</commit_message>
<xml_diff>
--- a/Watts Up - IT Summary and Security Assessment.docx
+++ b/Watts Up - IT Summary and Security Assessment.docx
@@ -40,7 +40,7 @@
           <w:b w:val="0"/>
           <w:i/>
         </w:rPr>
-        <w:t xml:space="preserve"> as of the release whose SHA-256 is given in §9; recompute the hash for any later copy before relying on this document. Current program version: 0.9.10 (testing build).</w:t>
+        <w:t xml:space="preserve"> as of the release whose SHA-256 is given in §9; recompute the hash for any later copy before relying on this document. Current program version: 0.9.11 (testing build).</w:t>
       </w:r>
     </w:p>
     <w:p>
@@ -3791,7 +3791,7 @@
           <w:b/>
           <w:i w:val="0"/>
         </w:rPr>
-        <w:t>Addendum, 2026-10-18 (version 0.9.0 onward — versioning and the Help guide; 0.9.1 to 0.9.10 changed only report layout and formatting, change-tracking marks (a second copy of the project's items stored in the project file), the Word Report dialog, one grid focus handler, shared-TRU editing, a load-time data repair and a generated row note, with no new network, storage or window behavior).</w:t>
+        <w:t>Addendum, 2026-10-18 (version 0.9.0 onward — versioning and the Help guide; 0.9.1 to 0.9.11 changed only report layout and formatting, change-tracking marks (a second copy of the project's items stored in the project file), the Word Report dialog, one grid focus handler, shared-TRU editing, a load-time data repair and a generated row note, with no new network, storage or window behavior).</w:t>
       </w:r>
       <w:r>
         <w:rPr>
@@ -4051,7 +4051,7 @@
           <w:b/>
           <w:i w:val="0"/>
         </w:rPr>
-        <w:t>, version 0.9.10, 753,787 bytes):</w:t>
+        <w:t>, version 0.9.11, 754,206 bytes):</w:t>
       </w:r>
       <w:r>
         <w:rPr>
@@ -4068,7 +4068,7 @@
           <w:sz w:val="19"/>
           <w:shd w:val="clear" w:color="auto" w:fill="EEF1F6"/>
         </w:rPr>
-        <w:t>9014b7f48b87306d514cbb093787c28190125431f3ee8e720ef2202755fef682</w:t>
+        <w:t>09fb7540c7231d7c52dd6283559c736b02de57f109df96be61a86b1939451325</w:t>
       </w:r>
       <w:r>
         <w:rPr>

</xml_diff>

<commit_message>
Version 0.9.12: unavailable Word content controls disabled, new missing-controls message, content-control table in the user guide
Co-Authored-By: Claude Sonnet 5.5 <noreply@anthropic.com>
</commit_message>
<xml_diff>
--- a/Watts Up - IT Summary and Security Assessment.docx
+++ b/Watts Up - IT Summary and Security Assessment.docx
@@ -40,7 +40,7 @@
           <w:b w:val="0"/>
           <w:i/>
         </w:rPr>
-        <w:t xml:space="preserve"> as of the release whose SHA-256 is given in §9; recompute the hash for any later copy before relying on this document. Current program version: 0.9.11 (testing build).</w:t>
+        <w:t xml:space="preserve"> as of the release whose SHA-256 is given in §9; recompute the hash for any later copy before relying on this document. Current program version: 0.9.12 (testing build).</w:t>
       </w:r>
     </w:p>
     <w:p>
@@ -3791,7 +3791,7 @@
           <w:b/>
           <w:i w:val="0"/>
         </w:rPr>
-        <w:t>Addendum, 2026-10-18 (version 0.9.0 onward — versioning and the Help guide; 0.9.1 to 0.9.11 changed only report layout and formatting, change-tracking marks (a second copy of the project's items stored in the project file), the Word Report dialog, one grid focus handler, shared-TRU editing, a load-time data repair and a generated row note, with no new network, storage or window behavior).</w:t>
+        <w:t>Addendum, 2026-10-18 (version 0.9.0 onward — versioning and the Help guide; 0.9.1 to 0.9.12 changed only report layout and formatting, change-tracking marks (a second copy of the project's items stored in the project file), the Word Report dialog, one grid focus handler, shared-TRU editing, a load-time data repair and a generated row note, with no new network, storage or window behavior).</w:t>
       </w:r>
       <w:r>
         <w:rPr>
@@ -4051,7 +4051,7 @@
           <w:b/>
           <w:i w:val="0"/>
         </w:rPr>
-        <w:t>, version 0.9.11, 754,206 bytes):</w:t>
+        <w:t>, version 0.9.12, 756,277 bytes):</w:t>
       </w:r>
       <w:r>
         <w:rPr>
@@ -4068,7 +4068,7 @@
           <w:sz w:val="19"/>
           <w:shd w:val="clear" w:color="auto" w:fill="EEF1F6"/>
         </w:rPr>
-        <w:t>09fb7540c7231d7c52dd6283559c736b02de57f109df96be61a86b1939451325</w:t>
+        <w:t>d4c2db119fa2c66481d239cf8d00b5ee2cb2bd783f5ed4cf29e37f472b9b872f</w:t>
       </w:r>
       <w:r>
         <w:rPr>

</xml_diff>

<commit_message>
Version 0.9.13: ask for Word write permission first, explain permission/write/read failures instead of failing silently, troubleshooting row in the guide
Co-Authored-By: Claude Sonnet 5.5 <noreply@anthropic.com>
</commit_message>
<xml_diff>
--- a/Watts Up - IT Summary and Security Assessment.docx
+++ b/Watts Up - IT Summary and Security Assessment.docx
@@ -40,7 +40,7 @@
           <w:b w:val="0"/>
           <w:i/>
         </w:rPr>
-        <w:t xml:space="preserve"> as of the release whose SHA-256 is given in §9; recompute the hash for any later copy before relying on this document. Current program version: 0.9.12 (testing build).</w:t>
+        <w:t xml:space="preserve"> as of the release whose SHA-256 is given in §9; recompute the hash for any later copy before relying on this document. Current program version: 0.9.13 (testing build).</w:t>
       </w:r>
     </w:p>
     <w:p>
@@ -3791,7 +3791,7 @@
           <w:b/>
           <w:i w:val="0"/>
         </w:rPr>
-        <w:t>Addendum, 2026-10-18 (version 0.9.0 onward — versioning and the Help guide; 0.9.1 to 0.9.12 changed only report layout and formatting, change-tracking marks (a second copy of the project's items stored in the project file), the Word Report dialog, one grid focus handler, shared-TRU editing, a load-time data repair and a generated row note, with no new network, storage or window behavior).</w:t>
+        <w:t>Addendum, 2026-10-18 (version 0.9.0 onward — versioning and the Help guide; 0.9.1 to 0.9.13 changed only report layout and formatting, change-tracking marks (a second copy of the project's items stored in the project file), the Word Report dialog, one grid focus handler, shared-TRU editing, a load-time data repair and a generated row note, with no new network, storage or window behavior).</w:t>
       </w:r>
       <w:r>
         <w:rPr>
@@ -4051,7 +4051,7 @@
           <w:b/>
           <w:i w:val="0"/>
         </w:rPr>
-        <w:t>, version 0.9.12, 756,277 bytes):</w:t>
+        <w:t>, version 0.9.13, 759,060 bytes):</w:t>
       </w:r>
       <w:r>
         <w:rPr>
@@ -4068,7 +4068,7 @@
           <w:sz w:val="19"/>
           <w:shd w:val="clear" w:color="auto" w:fill="EEF1F6"/>
         </w:rPr>
-        <w:t>d4c2db119fa2c66481d239cf8d00b5ee2cb2bd783f5ed4cf29e37f472b9b872f</w:t>
+        <w:t>b87ce4edc2781c61d1d10784f937732e0cb752eb34b0a28a6f7f92a1ea060d3f</w:t>
       </w:r>
       <w:r>
         <w:rPr>

</xml_diff>

<commit_message>
Version 0.9.14: Word sync works when the browser refuses the permission request - Connect Existing grants edit access at pick time, fallback to choosing the file again
Co-Authored-By: Claude Sonnet 5.5 <noreply@anthropic.com>
</commit_message>
<xml_diff>
--- a/Watts Up - IT Summary and Security Assessment.docx
+++ b/Watts Up - IT Summary and Security Assessment.docx
@@ -40,7 +40,7 @@
           <w:b w:val="0"/>
           <w:i/>
         </w:rPr>
-        <w:t xml:space="preserve"> as of the release whose SHA-256 is given in §9; recompute the hash for any later copy before relying on this document. Current program version: 0.9.13 (testing build).</w:t>
+        <w:t xml:space="preserve"> as of the release whose SHA-256 is given in §9; recompute the hash for any later copy before relying on this document. Current program version: 0.9.14 (testing build).</w:t>
       </w:r>
     </w:p>
     <w:p>
@@ -3791,7 +3791,7 @@
           <w:b/>
           <w:i w:val="0"/>
         </w:rPr>
-        <w:t>Addendum, 2026-10-18 (version 0.9.0 onward — versioning and the Help guide; 0.9.1 to 0.9.13 changed only report layout and formatting, change-tracking marks (a second copy of the project's items stored in the project file), the Word Report dialog, one grid focus handler, shared-TRU editing, a load-time data repair and a generated row note, with no new network, storage or window behavior).</w:t>
+        <w:t>Addendum, 2026-10-18 (version 0.9.0 onward — versioning and the Help guide; 0.9.1 to 0.9.14 changed only report layout and formatting, change-tracking marks (a second copy of the project's items stored in the project file), the Word Report dialog, one grid focus handler, shared-TRU editing, a load-time data repair and a generated row note, with no new network, storage or window behavior).</w:t>
       </w:r>
       <w:r>
         <w:rPr>
@@ -4051,7 +4051,7 @@
           <w:b/>
           <w:i w:val="0"/>
         </w:rPr>
-        <w:t>, version 0.9.13, 759,060 bytes):</w:t>
+        <w:t>, version 0.9.14, 761,452 bytes):</w:t>
       </w:r>
       <w:r>
         <w:rPr>
@@ -4068,7 +4068,7 @@
           <w:sz w:val="19"/>
           <w:shd w:val="clear" w:color="auto" w:fill="EEF1F6"/>
         </w:rPr>
-        <w:t>b87ce4edc2781c61d1d10784f937732e0cb752eb34b0a28a6f7f92a1ea060d3f</w:t>
+        <w:t>b23751e6f01d9b752d7493815b39fe312cb9a0a7d0ef2b2ce1868c6962cde29e</w:t>
       </w:r>
       <w:r>
         <w:rPr>

</xml_diff>

<commit_message>
Version 0.9.15: user guide says to run watts-up.html from a local drive - section 1.1 bullet and a first troubleshooting row for Word sync permission errors
Co-Authored-By: Claude Sonnet 5.5 <noreply@anthropic.com>
</commit_message>
<xml_diff>
--- a/Watts Up - IT Summary and Security Assessment.docx
+++ b/Watts Up - IT Summary and Security Assessment.docx
@@ -4051,7 +4051,7 @@
           <w:b/>
           <w:i w:val="0"/>
         </w:rPr>
-        <w:t>, version 0.9.14, 761,452 bytes):</w:t>
+        <w:t>, version 0.9.15, 762,698 bytes):</w:t>
       </w:r>
       <w:r>
         <w:rPr>
@@ -4068,7 +4068,7 @@
           <w:sz w:val="19"/>
           <w:shd w:val="clear" w:color="auto" w:fill="EEF1F6"/>
         </w:rPr>
-        <w:t>b23751e6f01d9b752d7493815b39fe312cb9a0a7d0ef2b2ce1868c6962cde29e</w:t>
+        <w:t>7e7a33eb223ef0c66ce6d46da78c19222d94c9b2f021c7f73449e1403017afc2</w:t>
       </w:r>
       <w:r>
         <w:rPr>

</xml_diff>

<commit_message>
Version 0.9.16: file dialogs open in the folder of the last file opened or saved - reference kept in IndexedDB, falls back to Downloads
Co-Authored-By: Claude Sonnet 5.5 <noreply@anthropic.com>
</commit_message>
<xml_diff>
--- a/Watts Up - IT Summary and Security Assessment.docx
+++ b/Watts Up - IT Summary and Security Assessment.docx
@@ -1053,7 +1053,7 @@
         </w:trPr>
         <w:tc>
           <w:tcPr>
-            <w:tcW w:type="dxa" w:w="2824"/>
+            <w:tcW w:type="dxa" w:w="2344"/>
             <w:shd w:val="clear" w:color="auto" w:fill="D9E2F3"/>
           </w:tcPr>
           <w:p>
@@ -1072,7 +1072,7 @@
         </w:tc>
         <w:tc>
           <w:tcPr>
-            <w:tcW w:type="dxa" w:w="3527"/>
+            <w:tcW w:type="dxa" w:w="3439"/>
             <w:shd w:val="clear" w:color="auto" w:fill="D9E2F3"/>
           </w:tcPr>
           <w:p>
@@ -1091,7 +1091,7 @@
         </w:tc>
         <w:tc>
           <w:tcPr>
-            <w:tcW w:type="dxa" w:w="3297"/>
+            <w:tcW w:type="dxa" w:w="3865"/>
             <w:shd w:val="clear" w:color="auto" w:fill="D9E2F3"/>
           </w:tcPr>
           <w:p>
@@ -1115,7 +1115,7 @@
         </w:trPr>
         <w:tc>
           <w:tcPr>
-            <w:tcW w:type="dxa" w:w="2824"/>
+            <w:tcW w:type="dxa" w:w="2344"/>
           </w:tcPr>
           <w:p>
             <w:pPr>
@@ -1161,7 +1161,7 @@
         </w:tc>
         <w:tc>
           <w:tcPr>
-            <w:tcW w:type="dxa" w:w="3527"/>
+            <w:tcW w:type="dxa" w:w="3439"/>
           </w:tcPr>
           <w:p>
             <w:pPr>
@@ -1179,7 +1179,7 @@
         </w:tc>
         <w:tc>
           <w:tcPr>
-            <w:tcW w:type="dxa" w:w="3297"/>
+            <w:tcW w:type="dxa" w:w="3865"/>
           </w:tcPr>
           <w:p>
             <w:pPr>
@@ -1202,7 +1202,94 @@
         </w:trPr>
         <w:tc>
           <w:tcPr>
-            <w:tcW w:type="dxa" w:w="2824"/>
+            <w:tcW w:type="dxa" w:w="2344"/>
+          </w:tcPr>
+          <w:p>
+            <w:pPr>
+              <w:spacing w:after="0"/>
+            </w:pPr>
+            <w:r>
+              <w:rPr>
+                <w:rFonts w:ascii="Consolas" w:hAnsi="Consolas" w:eastAsia="Consolas"/>
+                <w:b w:val="0"/>
+                <w:i w:val="0"/>
+                <w:sz w:val="17"/>
+                <w:shd w:val="clear" w:color="auto" w:fill="EEF1F6"/>
+              </w:rPr>
+              <w:t>IndexedDB</w:t>
+            </w:r>
+            <w:r>
+              <w:rPr>
+                <w:b w:val="0"/>
+                <w:i w:val="0"/>
+                <w:sz w:val="19"/>
+              </w:rPr>
+              <w:t xml:space="preserve"> (database </w:t>
+            </w:r>
+            <w:r>
+              <w:rPr>
+                <w:rFonts w:ascii="Consolas" w:hAnsi="Consolas" w:eastAsia="Consolas"/>
+                <w:b w:val="0"/>
+                <w:i w:val="0"/>
+                <w:sz w:val="17"/>
+                <w:shd w:val="clear" w:color="auto" w:fill="EEF1F6"/>
+              </w:rPr>
+              <w:t>wattsup_files</w:t>
+            </w:r>
+            <w:r>
+              <w:rPr>
+                <w:b w:val="0"/>
+                <w:i w:val="0"/>
+                <w:sz w:val="19"/>
+              </w:rPr>
+              <w:t>)</w:t>
+            </w:r>
+          </w:p>
+        </w:tc>
+        <w:tc>
+          <w:tcPr>
+            <w:tcW w:type="dxa" w:w="3439"/>
+          </w:tcPr>
+          <w:p>
+            <w:pPr>
+              <w:spacing w:after="0"/>
+            </w:pPr>
+            <w:r>
+              <w:rPr>
+                <w:b w:val="0"/>
+                <w:i w:val="0"/>
+                <w:sz w:val="19"/>
+              </w:rPr>
+              <w:t>Remembers the last file the user opened or saved so the next file dialog opens in that folder</w:t>
+            </w:r>
+          </w:p>
+        </w:tc>
+        <w:tc>
+          <w:tcPr>
+            <w:tcW w:type="dxa" w:w="3865"/>
+          </w:tcPr>
+          <w:p>
+            <w:pPr>
+              <w:spacing w:after="0"/>
+            </w:pPr>
+            <w:r>
+              <w:rPr>
+                <w:b w:val="0"/>
+                <w:i w:val="0"/>
+                <w:sz w:val="19"/>
+              </w:rPr>
+              <w:t>Holds only a handle reference to that one file (no contents; it grants no access by itself); per browser profile and web origin; cleared with site data</w:t>
+            </w:r>
+          </w:p>
+        </w:tc>
+      </w:tr>
+      <w:tr>
+        <w:trPr>
+          <w:cantSplit w:val="true"/>
+        </w:trPr>
+        <w:tc>
+          <w:tcPr>
+            <w:tcW w:type="dxa" w:w="2344"/>
           </w:tcPr>
           <w:p>
             <w:pPr>
@@ -1256,7 +1343,7 @@
         </w:tc>
         <w:tc>
           <w:tcPr>
-            <w:tcW w:type="dxa" w:w="3527"/>
+            <w:tcW w:type="dxa" w:w="3439"/>
           </w:tcPr>
           <w:p>
             <w:pPr>
@@ -1274,7 +1361,7 @@
         </w:tc>
         <w:tc>
           <w:tcPr>
-            <w:tcW w:type="dxa" w:w="3297"/>
+            <w:tcW w:type="dxa" w:w="3865"/>
           </w:tcPr>
           <w:p>
             <w:pPr>
@@ -1297,7 +1384,7 @@
         </w:trPr>
         <w:tc>
           <w:tcPr>
-            <w:tcW w:type="dxa" w:w="2824"/>
+            <w:tcW w:type="dxa" w:w="2344"/>
           </w:tcPr>
           <w:p>
             <w:pPr>
@@ -1343,7 +1430,7 @@
         </w:tc>
         <w:tc>
           <w:tcPr>
-            <w:tcW w:type="dxa" w:w="3527"/>
+            <w:tcW w:type="dxa" w:w="3439"/>
           </w:tcPr>
           <w:p>
             <w:pPr>
@@ -1361,7 +1448,7 @@
         </w:tc>
         <w:tc>
           <w:tcPr>
-            <w:tcW w:type="dxa" w:w="3297"/>
+            <w:tcW w:type="dxa" w:w="3865"/>
           </w:tcPr>
           <w:p>
             <w:pPr>
@@ -1384,7 +1471,7 @@
         </w:trPr>
         <w:tc>
           <w:tcPr>
-            <w:tcW w:type="dxa" w:w="2824"/>
+            <w:tcW w:type="dxa" w:w="2344"/>
           </w:tcPr>
           <w:p>
             <w:pPr>
@@ -1402,7 +1489,7 @@
         </w:tc>
         <w:tc>
           <w:tcPr>
-            <w:tcW w:type="dxa" w:w="3527"/>
+            <w:tcW w:type="dxa" w:w="3439"/>
           </w:tcPr>
           <w:p>
             <w:pPr>
@@ -1430,7 +1517,7 @@
         </w:tc>
         <w:tc>
           <w:tcPr>
-            <w:tcW w:type="dxa" w:w="3297"/>
+            <w:tcW w:type="dxa" w:w="3865"/>
           </w:tcPr>
           <w:p>
             <w:pPr>
@@ -1519,7 +1606,7 @@
           <w:b w:val="0"/>
           <w:i w:val="0"/>
         </w:rPr>
-        <w:t xml:space="preserve">, no web workers or service workers, no geolocation/camera/microphone/clipboard access, no IndexedDB, no </w:t>
+        <w:t xml:space="preserve">, no web workers or service workers, no geolocation/camera/microphone/clipboard access, no IndexedDB use beyond the one stored file reference (§3.3), no </w:t>
       </w:r>
       <w:r>
         <w:rPr>
@@ -1793,7 +1880,7 @@
           <w:b w:val="0"/>
           <w:i w:val="0"/>
         </w:rPr>
-        <w:t>) on each user's machine — unencrypted, kept until cleared.</w:t>
+        <w:t>, and an IndexedDB reference to the last picked file — no contents) on each user's machine — unencrypted, kept until cleared.</w:t>
       </w:r>
     </w:p>
     <w:p>
@@ -4051,7 +4138,7 @@
           <w:b/>
           <w:i w:val="0"/>
         </w:rPr>
-        <w:t>, version 0.9.15, 762,698 bytes):</w:t>
+        <w:t>, version 0.9.16, 765590 bytes):</w:t>
       </w:r>
       <w:r>
         <w:rPr>
@@ -4068,7 +4155,7 @@
           <w:sz w:val="19"/>
           <w:shd w:val="clear" w:color="auto" w:fill="EEF1F6"/>
         </w:rPr>
-        <w:t>7e7a33eb223ef0c66ce6d46da78c19222d94c9b2f021c7f73449e1403017afc2</w:t>
+        <w:t>8cb482369a4158f6912f544a8553fe5d4126a79f2de00f72830ab4884b868d56</w:t>
       </w:r>
       <w:r>
         <w:rPr>

</xml_diff>

<commit_message>
Version 0.9.17: fine vertical borders between the unit columns of a column group in all Word report tables; none between description and rating
Co-Authored-By: Claude Sonnet 5.5 <noreply@anthropic.com>
</commit_message>
<xml_diff>
--- a/Watts Up - IT Summary and Security Assessment.docx
+++ b/Watts Up - IT Summary and Security Assessment.docx
@@ -4138,7 +4138,7 @@
           <w:b/>
           <w:i w:val="0"/>
         </w:rPr>
-        <w:t>, version 0.9.16, 765590 bytes):</w:t>
+        <w:t>, version 0.9.17, 765931 bytes):</w:t>
       </w:r>
       <w:r>
         <w:rPr>
@@ -4155,7 +4155,7 @@
           <w:sz w:val="19"/>
           <w:shd w:val="clear" w:color="auto" w:fill="EEF1F6"/>
         </w:rPr>
-        <w:t>8cb482369a4158f6912f544a8553fe5d4126a79f2de00f72830ab4884b868d56</w:t>
+        <w:t>b75a2a3f972542d561746771129ef137d05ad39bd6d267a7416eb15daa6b2700</w:t>
       </w:r>
       <w:r>
         <w:rPr>

</xml_diff>